<commit_message>
Añade el enlace del repositorio a la portada del informe
Co-Authored-By: Claude Sonnet 5.5 <noreply@anthropic.com>
</commit_message>
<xml_diff>
--- a/TRABAJO WIDGETS FLUTTER.docx
+++ b/TRABAJO WIDGETS FLUTTER.docx
@@ -153,6 +153,31 @@
         </w:rPr>
         <w:t>Herramienta de IA utilizada: Claude (Anthropic)</w:t>
       </w:r>
+    </w:p>
+    <w:p>
+      <w:pPr>
+        <w:jc w:val="center"/>
+        <w:spacing w:before="120" w:after="0"/>
+      </w:pPr>
+      <w:r>
+        <w:rPr>
+          <w:color w:val="6D5B54"/>
+          <w:sz w:val="20"/>
+          <w:szCs w:val="20"/>
+        </w:rPr>
+        <w:t xml:space="preserve">Repositorio: </w:t>
+      </w:r>
+      <w:hyperlink r:id="rIdRepoGit">
+        <w:r>
+          <w:rPr>
+            <w:color w:val="E65100"/>
+            <w:sz w:val="20"/>
+            <w:szCs w:val="20"/>
+            <w:u w:val="single"/>
+          </w:rPr>
+          <w:t>https://github.com/JaviCuetin/trabajo_Flutter_IA</w:t>
+        </w:r>
+      </w:hyperlink>
     </w:p>
     <w:p>
       <w:r>

</xml_diff>